<commit_message>
Refresh workshop download materials
</commit_message>
<xml_diff>
--- a/downloads/tool_workshop_material/第7章_ワークシート.docx
+++ b/downloads/tool_workshop_material/第7章_ワークシート.docx
@@ -845,7 +845,7 @@
           <w:sz w:val="18"/>
           <w:szCs w:val="18"/>
         </w:rPr>
-        <w:t>各自が持ち寄った案を共有し、型の異なる2案を残して比べて決めます。1つを選ばず、複数の案を組み合わせてもかまいません。型（チャットボット／AIエージェント／AIワークフロー）は、ここで決めます。</w:t>
+        <w:t>各自が持ち寄った案を共有し、グループで作るAIツールを決めます。1つを選ばず、複数の案を組み合わせてもかまいません。作るAIツールの種類（チャットボット／AIエージェント／AIワークフロー）も、ここで決めます。</w:t>
       </w:r>
     </w:p>
     <w:tbl>
@@ -866,10 +866,10 @@
         <w:tblLook w:val="0000" w:firstRow="0" w:lastRow="0" w:firstColumn="0" w:lastColumn="0" w:noHBand="0" w:noVBand="0"/>
       </w:tblPr>
       <w:tblGrid>
-        <w:gridCol w:w="2505"/>
-        <w:gridCol w:w="1879"/>
-        <w:gridCol w:w="1462"/>
-        <w:gridCol w:w="3180"/>
+        <w:gridCol w:w="2100"/>
+        <w:gridCol w:w="1700"/>
+        <w:gridCol w:w="2300"/>
+        <w:gridCol w:w="2546"/>
       </w:tblGrid>
       <w:tr>
         <w:trPr>
@@ -877,7 +877,7 @@
         </w:trPr>
         <w:tc>
           <w:tcPr>
-            <w:tcW w:w="2400" w:type="dxa"/>
+            <w:tcW w:w="2100" w:type="dxa"/>
             <w:tcBorders>
               <w:top w:val="single" w:sz="1" w:space="0" w:color="A0A0A0"/>
               <w:left w:val="single" w:sz="1" w:space="0" w:color="A0A0A0"/>
@@ -913,7 +913,7 @@
         </w:tc>
         <w:tc>
           <w:tcPr>
-            <w:tcW w:w="1800" w:type="dxa"/>
+            <w:tcW w:w="1700" w:type="dxa"/>
             <w:tcBorders>
               <w:top w:val="single" w:sz="1" w:space="0" w:color="A0A0A0"/>
               <w:left w:val="single" w:sz="1" w:space="0" w:color="A0A0A0"/>
@@ -949,7 +949,7 @@
         </w:tc>
         <w:tc>
           <w:tcPr>
-            <w:tcW w:w="1400" w:type="dxa"/>
+            <w:tcW w:w="2300" w:type="dxa"/>
             <w:tcBorders>
               <w:top w:val="single" w:sz="1" w:space="0" w:color="A0A0A0"/>
               <w:left w:val="single" w:sz="1" w:space="0" w:color="A0A0A0"/>
@@ -979,13 +979,13 @@
                 <w:sz w:val="19"/>
                 <w:szCs w:val="19"/>
               </w:rPr>
-              <w:t>使う型</w:t>
-            </w:r>
-          </w:p>
-        </w:tc>
-        <w:tc>
-          <w:tcPr>
-            <w:tcW w:w="3046" w:type="dxa"/>
+              <w:t>作るAIツールの種類</w:t>
+            </w:r>
+          </w:p>
+        </w:tc>
+        <w:tc>
+          <w:tcPr>
+            <w:tcW w:w="2546" w:type="dxa"/>
             <w:tcBorders>
               <w:top w:val="single" w:sz="1" w:space="0" w:color="A0A0A0"/>
               <w:left w:val="single" w:sz="1" w:space="0" w:color="A0A0A0"/>
@@ -1023,7 +1023,7 @@
       <w:tr>
         <w:tc>
           <w:tcPr>
-            <w:tcW w:w="2400" w:type="dxa"/>
+            <w:tcW w:w="2100" w:type="dxa"/>
             <w:tcBorders>
               <w:top w:val="single" w:sz="1" w:space="0" w:color="A0A0A0"/>
               <w:left w:val="single" w:sz="1" w:space="0" w:color="A0A0A0"/>
@@ -1057,7 +1057,7 @@
         </w:tc>
         <w:tc>
           <w:tcPr>
-            <w:tcW w:w="1800" w:type="dxa"/>
+            <w:tcW w:w="1700" w:type="dxa"/>
             <w:tcBorders>
               <w:top w:val="single" w:sz="1" w:space="0" w:color="A0A0A0"/>
               <w:left w:val="single" w:sz="1" w:space="0" w:color="A0A0A0"/>
@@ -1091,7 +1091,7 @@
         </w:tc>
         <w:tc>
           <w:tcPr>
-            <w:tcW w:w="1400" w:type="dxa"/>
+            <w:tcW w:w="2300" w:type="dxa"/>
             <w:tcBorders>
               <w:top w:val="single" w:sz="1" w:space="0" w:color="A0A0A0"/>
               <w:left w:val="single" w:sz="1" w:space="0" w:color="A0A0A0"/>
@@ -1125,7 +1125,7 @@
         </w:tc>
         <w:tc>
           <w:tcPr>
-            <w:tcW w:w="3046" w:type="dxa"/>
+            <w:tcW w:w="2546" w:type="dxa"/>
             <w:tcBorders>
               <w:top w:val="single" w:sz="1" w:space="0" w:color="A0A0A0"/>
               <w:left w:val="single" w:sz="1" w:space="0" w:color="A0A0A0"/>
@@ -1161,103 +1161,103 @@
       <w:tr>
         <w:tc>
           <w:tcPr>
-            <w:tcW w:w="2400" w:type="dxa"/>
-            <w:tcBorders>
-              <w:top w:val="single" w:sz="1" w:space="0" w:color="A0A0A0"/>
-              <w:left w:val="single" w:sz="1" w:space="0" w:color="A0A0A0"/>
-              <w:bottom w:val="single" w:sz="1" w:space="0" w:color="A0A0A0"/>
-              <w:right w:val="single" w:sz="1" w:space="0" w:color="A0A0A0"/>
-            </w:tcBorders>
-            <w:shd w:val="clear" w:color="auto" w:fill="FFFFFF"/>
-            <w:tcMar>
-              <w:top w:w="60" w:type="dxa"/>
-              <w:left w:w="100" w:type="dxa"/>
-              <w:bottom w:w="60" w:type="dxa"/>
-              <w:right w:w="100" w:type="dxa"/>
-            </w:tcMar>
-          </w:tcPr>
-          <w:p>
-            <w:pPr>
-              <w:rPr>
-                <w:rFonts w:eastAsia="Meiryo UI"/>
-              </w:rPr>
-            </w:pPr>
-          </w:p>
-          <w:p>
-            <w:pPr>
-              <w:rPr>
-                <w:rFonts w:eastAsia="Meiryo UI"/>
-              </w:rPr>
-            </w:pPr>
-          </w:p>
-        </w:tc>
-        <w:tc>
-          <w:tcPr>
-            <w:tcW w:w="1800" w:type="dxa"/>
-            <w:tcBorders>
-              <w:top w:val="single" w:sz="1" w:space="0" w:color="A0A0A0"/>
-              <w:left w:val="single" w:sz="1" w:space="0" w:color="A0A0A0"/>
-              <w:bottom w:val="single" w:sz="1" w:space="0" w:color="A0A0A0"/>
-              <w:right w:val="single" w:sz="1" w:space="0" w:color="A0A0A0"/>
-            </w:tcBorders>
-            <w:shd w:val="clear" w:color="auto" w:fill="FFFFFF"/>
-            <w:tcMar>
-              <w:top w:w="60" w:type="dxa"/>
-              <w:left w:w="100" w:type="dxa"/>
-              <w:bottom w:w="60" w:type="dxa"/>
-              <w:right w:w="100" w:type="dxa"/>
-            </w:tcMar>
-          </w:tcPr>
-          <w:p>
-            <w:pPr>
-              <w:rPr>
-                <w:rFonts w:eastAsia="Meiryo UI"/>
-              </w:rPr>
-            </w:pPr>
-          </w:p>
-          <w:p>
-            <w:pPr>
-              <w:rPr>
-                <w:rFonts w:eastAsia="Meiryo UI"/>
-              </w:rPr>
-            </w:pPr>
-          </w:p>
-        </w:tc>
-        <w:tc>
-          <w:tcPr>
-            <w:tcW w:w="1400" w:type="dxa"/>
-            <w:tcBorders>
-              <w:top w:val="single" w:sz="1" w:space="0" w:color="A0A0A0"/>
-              <w:left w:val="single" w:sz="1" w:space="0" w:color="A0A0A0"/>
-              <w:bottom w:val="single" w:sz="1" w:space="0" w:color="A0A0A0"/>
-              <w:right w:val="single" w:sz="1" w:space="0" w:color="A0A0A0"/>
-            </w:tcBorders>
-            <w:shd w:val="clear" w:color="auto" w:fill="FFFFFF"/>
-            <w:tcMar>
-              <w:top w:w="60" w:type="dxa"/>
-              <w:left w:w="100" w:type="dxa"/>
-              <w:bottom w:w="60" w:type="dxa"/>
-              <w:right w:w="100" w:type="dxa"/>
-            </w:tcMar>
-          </w:tcPr>
-          <w:p>
-            <w:pPr>
-              <w:rPr>
-                <w:rFonts w:eastAsia="Meiryo UI"/>
-              </w:rPr>
-            </w:pPr>
-          </w:p>
-          <w:p>
-            <w:pPr>
-              <w:rPr>
-                <w:rFonts w:eastAsia="Meiryo UI"/>
-              </w:rPr>
-            </w:pPr>
-          </w:p>
-        </w:tc>
-        <w:tc>
-          <w:tcPr>
-            <w:tcW w:w="3046" w:type="dxa"/>
+            <w:tcW w:w="2100" w:type="dxa"/>
+            <w:tcBorders>
+              <w:top w:val="single" w:sz="1" w:space="0" w:color="A0A0A0"/>
+              <w:left w:val="single" w:sz="1" w:space="0" w:color="A0A0A0"/>
+              <w:bottom w:val="single" w:sz="1" w:space="0" w:color="A0A0A0"/>
+              <w:right w:val="single" w:sz="1" w:space="0" w:color="A0A0A0"/>
+            </w:tcBorders>
+            <w:shd w:val="clear" w:color="auto" w:fill="FFFFFF"/>
+            <w:tcMar>
+              <w:top w:w="60" w:type="dxa"/>
+              <w:left w:w="100" w:type="dxa"/>
+              <w:bottom w:w="60" w:type="dxa"/>
+              <w:right w:w="100" w:type="dxa"/>
+            </w:tcMar>
+          </w:tcPr>
+          <w:p>
+            <w:pPr>
+              <w:rPr>
+                <w:rFonts w:eastAsia="Meiryo UI"/>
+              </w:rPr>
+            </w:pPr>
+          </w:p>
+          <w:p>
+            <w:pPr>
+              <w:rPr>
+                <w:rFonts w:eastAsia="Meiryo UI"/>
+              </w:rPr>
+            </w:pPr>
+          </w:p>
+        </w:tc>
+        <w:tc>
+          <w:tcPr>
+            <w:tcW w:w="1700" w:type="dxa"/>
+            <w:tcBorders>
+              <w:top w:val="single" w:sz="1" w:space="0" w:color="A0A0A0"/>
+              <w:left w:val="single" w:sz="1" w:space="0" w:color="A0A0A0"/>
+              <w:bottom w:val="single" w:sz="1" w:space="0" w:color="A0A0A0"/>
+              <w:right w:val="single" w:sz="1" w:space="0" w:color="A0A0A0"/>
+            </w:tcBorders>
+            <w:shd w:val="clear" w:color="auto" w:fill="FFFFFF"/>
+            <w:tcMar>
+              <w:top w:w="60" w:type="dxa"/>
+              <w:left w:w="100" w:type="dxa"/>
+              <w:bottom w:w="60" w:type="dxa"/>
+              <w:right w:w="100" w:type="dxa"/>
+            </w:tcMar>
+          </w:tcPr>
+          <w:p>
+            <w:pPr>
+              <w:rPr>
+                <w:rFonts w:eastAsia="Meiryo UI"/>
+              </w:rPr>
+            </w:pPr>
+          </w:p>
+          <w:p>
+            <w:pPr>
+              <w:rPr>
+                <w:rFonts w:eastAsia="Meiryo UI"/>
+              </w:rPr>
+            </w:pPr>
+          </w:p>
+        </w:tc>
+        <w:tc>
+          <w:tcPr>
+            <w:tcW w:w="2300" w:type="dxa"/>
+            <w:tcBorders>
+              <w:top w:val="single" w:sz="1" w:space="0" w:color="A0A0A0"/>
+              <w:left w:val="single" w:sz="1" w:space="0" w:color="A0A0A0"/>
+              <w:bottom w:val="single" w:sz="1" w:space="0" w:color="A0A0A0"/>
+              <w:right w:val="single" w:sz="1" w:space="0" w:color="A0A0A0"/>
+            </w:tcBorders>
+            <w:shd w:val="clear" w:color="auto" w:fill="FFFFFF"/>
+            <w:tcMar>
+              <w:top w:w="60" w:type="dxa"/>
+              <w:left w:w="100" w:type="dxa"/>
+              <w:bottom w:w="60" w:type="dxa"/>
+              <w:right w:w="100" w:type="dxa"/>
+            </w:tcMar>
+          </w:tcPr>
+          <w:p>
+            <w:pPr>
+              <w:rPr>
+                <w:rFonts w:eastAsia="Meiryo UI"/>
+              </w:rPr>
+            </w:pPr>
+          </w:p>
+          <w:p>
+            <w:pPr>
+              <w:rPr>
+                <w:rFonts w:eastAsia="Meiryo UI"/>
+              </w:rPr>
+            </w:pPr>
+          </w:p>
+        </w:tc>
+        <w:tc>
+          <w:tcPr>
+            <w:tcW w:w="2546" w:type="dxa"/>
             <w:tcBorders>
               <w:top w:val="single" w:sz="1" w:space="0" w:color="A0A0A0"/>
               <w:left w:val="single" w:sz="1" w:space="0" w:color="A0A0A0"/>
@@ -1291,103 +1291,103 @@
       <w:tr>
         <w:tc>
           <w:tcPr>
-            <w:tcW w:w="2400" w:type="dxa"/>
-            <w:tcBorders>
-              <w:top w:val="single" w:sz="1" w:space="0" w:color="A0A0A0"/>
-              <w:left w:val="single" w:sz="1" w:space="0" w:color="A0A0A0"/>
-              <w:bottom w:val="single" w:sz="1" w:space="0" w:color="A0A0A0"/>
-              <w:right w:val="single" w:sz="1" w:space="0" w:color="A0A0A0"/>
-            </w:tcBorders>
-            <w:shd w:val="clear" w:color="auto" w:fill="FFFFFF"/>
-            <w:tcMar>
-              <w:top w:w="60" w:type="dxa"/>
-              <w:left w:w="100" w:type="dxa"/>
-              <w:bottom w:w="60" w:type="dxa"/>
-              <w:right w:w="100" w:type="dxa"/>
-            </w:tcMar>
-          </w:tcPr>
-          <w:p>
-            <w:pPr>
-              <w:rPr>
-                <w:rFonts w:eastAsia="Meiryo UI"/>
-              </w:rPr>
-            </w:pPr>
-          </w:p>
-          <w:p>
-            <w:pPr>
-              <w:rPr>
-                <w:rFonts w:eastAsia="Meiryo UI"/>
-              </w:rPr>
-            </w:pPr>
-          </w:p>
-        </w:tc>
-        <w:tc>
-          <w:tcPr>
-            <w:tcW w:w="1800" w:type="dxa"/>
-            <w:tcBorders>
-              <w:top w:val="single" w:sz="1" w:space="0" w:color="A0A0A0"/>
-              <w:left w:val="single" w:sz="1" w:space="0" w:color="A0A0A0"/>
-              <w:bottom w:val="single" w:sz="1" w:space="0" w:color="A0A0A0"/>
-              <w:right w:val="single" w:sz="1" w:space="0" w:color="A0A0A0"/>
-            </w:tcBorders>
-            <w:shd w:val="clear" w:color="auto" w:fill="FFFFFF"/>
-            <w:tcMar>
-              <w:top w:w="60" w:type="dxa"/>
-              <w:left w:w="100" w:type="dxa"/>
-              <w:bottom w:w="60" w:type="dxa"/>
-              <w:right w:w="100" w:type="dxa"/>
-            </w:tcMar>
-          </w:tcPr>
-          <w:p>
-            <w:pPr>
-              <w:rPr>
-                <w:rFonts w:eastAsia="Meiryo UI"/>
-              </w:rPr>
-            </w:pPr>
-          </w:p>
-          <w:p>
-            <w:pPr>
-              <w:rPr>
-                <w:rFonts w:eastAsia="Meiryo UI"/>
-              </w:rPr>
-            </w:pPr>
-          </w:p>
-        </w:tc>
-        <w:tc>
-          <w:tcPr>
-            <w:tcW w:w="1400" w:type="dxa"/>
-            <w:tcBorders>
-              <w:top w:val="single" w:sz="1" w:space="0" w:color="A0A0A0"/>
-              <w:left w:val="single" w:sz="1" w:space="0" w:color="A0A0A0"/>
-              <w:bottom w:val="single" w:sz="1" w:space="0" w:color="A0A0A0"/>
-              <w:right w:val="single" w:sz="1" w:space="0" w:color="A0A0A0"/>
-            </w:tcBorders>
-            <w:shd w:val="clear" w:color="auto" w:fill="FFFFFF"/>
-            <w:tcMar>
-              <w:top w:w="60" w:type="dxa"/>
-              <w:left w:w="100" w:type="dxa"/>
-              <w:bottom w:w="60" w:type="dxa"/>
-              <w:right w:w="100" w:type="dxa"/>
-            </w:tcMar>
-          </w:tcPr>
-          <w:p>
-            <w:pPr>
-              <w:rPr>
-                <w:rFonts w:eastAsia="Meiryo UI"/>
-              </w:rPr>
-            </w:pPr>
-          </w:p>
-          <w:p>
-            <w:pPr>
-              <w:rPr>
-                <w:rFonts w:eastAsia="Meiryo UI"/>
-              </w:rPr>
-            </w:pPr>
-          </w:p>
-        </w:tc>
-        <w:tc>
-          <w:tcPr>
-            <w:tcW w:w="3046" w:type="dxa"/>
+            <w:tcW w:w="2100" w:type="dxa"/>
+            <w:tcBorders>
+              <w:top w:val="single" w:sz="1" w:space="0" w:color="A0A0A0"/>
+              <w:left w:val="single" w:sz="1" w:space="0" w:color="A0A0A0"/>
+              <w:bottom w:val="single" w:sz="1" w:space="0" w:color="A0A0A0"/>
+              <w:right w:val="single" w:sz="1" w:space="0" w:color="A0A0A0"/>
+            </w:tcBorders>
+            <w:shd w:val="clear" w:color="auto" w:fill="FFFFFF"/>
+            <w:tcMar>
+              <w:top w:w="60" w:type="dxa"/>
+              <w:left w:w="100" w:type="dxa"/>
+              <w:bottom w:w="60" w:type="dxa"/>
+              <w:right w:w="100" w:type="dxa"/>
+            </w:tcMar>
+          </w:tcPr>
+          <w:p>
+            <w:pPr>
+              <w:rPr>
+                <w:rFonts w:eastAsia="Meiryo UI"/>
+              </w:rPr>
+            </w:pPr>
+          </w:p>
+          <w:p>
+            <w:pPr>
+              <w:rPr>
+                <w:rFonts w:eastAsia="Meiryo UI"/>
+              </w:rPr>
+            </w:pPr>
+          </w:p>
+        </w:tc>
+        <w:tc>
+          <w:tcPr>
+            <w:tcW w:w="1700" w:type="dxa"/>
+            <w:tcBorders>
+              <w:top w:val="single" w:sz="1" w:space="0" w:color="A0A0A0"/>
+              <w:left w:val="single" w:sz="1" w:space="0" w:color="A0A0A0"/>
+              <w:bottom w:val="single" w:sz="1" w:space="0" w:color="A0A0A0"/>
+              <w:right w:val="single" w:sz="1" w:space="0" w:color="A0A0A0"/>
+            </w:tcBorders>
+            <w:shd w:val="clear" w:color="auto" w:fill="FFFFFF"/>
+            <w:tcMar>
+              <w:top w:w="60" w:type="dxa"/>
+              <w:left w:w="100" w:type="dxa"/>
+              <w:bottom w:w="60" w:type="dxa"/>
+              <w:right w:w="100" w:type="dxa"/>
+            </w:tcMar>
+          </w:tcPr>
+          <w:p>
+            <w:pPr>
+              <w:rPr>
+                <w:rFonts w:eastAsia="Meiryo UI"/>
+              </w:rPr>
+            </w:pPr>
+          </w:p>
+          <w:p>
+            <w:pPr>
+              <w:rPr>
+                <w:rFonts w:eastAsia="Meiryo UI"/>
+              </w:rPr>
+            </w:pPr>
+          </w:p>
+        </w:tc>
+        <w:tc>
+          <w:tcPr>
+            <w:tcW w:w="2300" w:type="dxa"/>
+            <w:tcBorders>
+              <w:top w:val="single" w:sz="1" w:space="0" w:color="A0A0A0"/>
+              <w:left w:val="single" w:sz="1" w:space="0" w:color="A0A0A0"/>
+              <w:bottom w:val="single" w:sz="1" w:space="0" w:color="A0A0A0"/>
+              <w:right w:val="single" w:sz="1" w:space="0" w:color="A0A0A0"/>
+            </w:tcBorders>
+            <w:shd w:val="clear" w:color="auto" w:fill="FFFFFF"/>
+            <w:tcMar>
+              <w:top w:w="60" w:type="dxa"/>
+              <w:left w:w="100" w:type="dxa"/>
+              <w:bottom w:w="60" w:type="dxa"/>
+              <w:right w:w="100" w:type="dxa"/>
+            </w:tcMar>
+          </w:tcPr>
+          <w:p>
+            <w:pPr>
+              <w:rPr>
+                <w:rFonts w:eastAsia="Meiryo UI"/>
+              </w:rPr>
+            </w:pPr>
+          </w:p>
+          <w:p>
+            <w:pPr>
+              <w:rPr>
+                <w:rFonts w:eastAsia="Meiryo UI"/>
+              </w:rPr>
+            </w:pPr>
+          </w:p>
+        </w:tc>
+        <w:tc>
+          <w:tcPr>
+            <w:tcW w:w="2546" w:type="dxa"/>
             <w:tcBorders>
               <w:top w:val="single" w:sz="1" w:space="0" w:color="A0A0A0"/>
               <w:left w:val="single" w:sz="1" w:space="0" w:color="A0A0A0"/>
@@ -2174,31 +2174,7 @@
               </w:rPr>
             </w:pPr>
             <w:r>
-              <w:t>［　］型を変える　［　］</w:t>
-            </w:r>
-            <w:r>
-              <w:t>AI</w:t>
-            </w:r>
-            <w:r>
-              <w:t>にさせる仕事を変える　［　］</w:t>
-            </w:r>
-            <w:r>
-              <w:t>1</w:t>
-            </w:r>
-            <w:r>
-              <w:t>回目の弱点を先に潰す　［　］テストを先に決める　（</w:t>
-            </w:r>
-            <w:r>
-              <w:t>1</w:t>
-            </w:r>
-            <w:r>
-              <w:t>つに</w:t>
-            </w:r>
-            <w:r>
-              <w:t xml:space="preserve"> x</w:t>
-            </w:r>
-            <w:r>
-              <w:t>）</w:t>
+              <w:t>［　］異なるAIツールに変える　［　］AIにさせる仕事を変える　（1つに x）</w:t>
             </w:r>
           </w:p>
         </w:tc>
@@ -2915,7 +2891,7 @@
           <w:sz w:val="18"/>
           <w:szCs w:val="18"/>
         </w:rPr>
-        <w:t>各自が持ち寄った案を共有し、型の異なる2案を残して比べて決めます。1つを選ばず、複数の案を組み合わせてもかまいません。型（チャットボット／AIエージェント／AIワークフロー）は、ここで決めます。</w:t>
+        <w:t>各自が持ち寄った案を共有し、グループで作るAIツールを決めます。1つを選ばず、複数の案を組み合わせてもかまいません。作るAIツールの種類（チャットボット／AIエージェント／AIワークフロー）も、ここで決めます。</w:t>
       </w:r>
     </w:p>
     <w:tbl>
@@ -2936,10 +2912,10 @@
         <w:tblLook w:val="0000" w:firstRow="0" w:lastRow="0" w:firstColumn="0" w:lastColumn="0" w:noHBand="0" w:noVBand="0"/>
       </w:tblPr>
       <w:tblGrid>
-        <w:gridCol w:w="2505"/>
-        <w:gridCol w:w="1879"/>
-        <w:gridCol w:w="1462"/>
-        <w:gridCol w:w="3180"/>
+        <w:gridCol w:w="2100"/>
+        <w:gridCol w:w="1700"/>
+        <w:gridCol w:w="2300"/>
+        <w:gridCol w:w="2546"/>
       </w:tblGrid>
       <w:tr>
         <w:trPr>
@@ -2947,7 +2923,7 @@
         </w:trPr>
         <w:tc>
           <w:tcPr>
-            <w:tcW w:w="2400" w:type="dxa"/>
+            <w:tcW w:w="2100" w:type="dxa"/>
             <w:tcBorders>
               <w:top w:val="single" w:sz="1" w:space="0" w:color="A0A0A0"/>
               <w:left w:val="single" w:sz="1" w:space="0" w:color="A0A0A0"/>
@@ -2983,7 +2959,7 @@
         </w:tc>
         <w:tc>
           <w:tcPr>
-            <w:tcW w:w="1800" w:type="dxa"/>
+            <w:tcW w:w="1700" w:type="dxa"/>
             <w:tcBorders>
               <w:top w:val="single" w:sz="1" w:space="0" w:color="A0A0A0"/>
               <w:left w:val="single" w:sz="1" w:space="0" w:color="A0A0A0"/>
@@ -3019,7 +2995,7 @@
         </w:tc>
         <w:tc>
           <w:tcPr>
-            <w:tcW w:w="1400" w:type="dxa"/>
+            <w:tcW w:w="2300" w:type="dxa"/>
             <w:tcBorders>
               <w:top w:val="single" w:sz="1" w:space="0" w:color="A0A0A0"/>
               <w:left w:val="single" w:sz="1" w:space="0" w:color="A0A0A0"/>
@@ -3049,13 +3025,13 @@
                 <w:sz w:val="19"/>
                 <w:szCs w:val="19"/>
               </w:rPr>
-              <w:t>使う型</w:t>
-            </w:r>
-          </w:p>
-        </w:tc>
-        <w:tc>
-          <w:tcPr>
-            <w:tcW w:w="3046" w:type="dxa"/>
+              <w:t>作るAIツールの種類</w:t>
+            </w:r>
+          </w:p>
+        </w:tc>
+        <w:tc>
+          <w:tcPr>
+            <w:tcW w:w="2546" w:type="dxa"/>
             <w:tcBorders>
               <w:top w:val="single" w:sz="1" w:space="0" w:color="A0A0A0"/>
               <w:left w:val="single" w:sz="1" w:space="0" w:color="A0A0A0"/>
@@ -3093,7 +3069,7 @@
       <w:tr>
         <w:tc>
           <w:tcPr>
-            <w:tcW w:w="2400" w:type="dxa"/>
+            <w:tcW w:w="2100" w:type="dxa"/>
             <w:tcBorders>
               <w:top w:val="single" w:sz="1" w:space="0" w:color="A0A0A0"/>
               <w:left w:val="single" w:sz="1" w:space="0" w:color="A0A0A0"/>
@@ -3127,7 +3103,7 @@
         </w:tc>
         <w:tc>
           <w:tcPr>
-            <w:tcW w:w="1800" w:type="dxa"/>
+            <w:tcW w:w="1700" w:type="dxa"/>
             <w:tcBorders>
               <w:top w:val="single" w:sz="1" w:space="0" w:color="A0A0A0"/>
               <w:left w:val="single" w:sz="1" w:space="0" w:color="A0A0A0"/>
@@ -3161,7 +3137,7 @@
         </w:tc>
         <w:tc>
           <w:tcPr>
-            <w:tcW w:w="1400" w:type="dxa"/>
+            <w:tcW w:w="2300" w:type="dxa"/>
             <w:tcBorders>
               <w:top w:val="single" w:sz="1" w:space="0" w:color="A0A0A0"/>
               <w:left w:val="single" w:sz="1" w:space="0" w:color="A0A0A0"/>
@@ -3195,7 +3171,7 @@
         </w:tc>
         <w:tc>
           <w:tcPr>
-            <w:tcW w:w="3046" w:type="dxa"/>
+            <w:tcW w:w="2546" w:type="dxa"/>
             <w:tcBorders>
               <w:top w:val="single" w:sz="1" w:space="0" w:color="A0A0A0"/>
               <w:left w:val="single" w:sz="1" w:space="0" w:color="A0A0A0"/>
@@ -3231,103 +3207,103 @@
       <w:tr>
         <w:tc>
           <w:tcPr>
-            <w:tcW w:w="2400" w:type="dxa"/>
-            <w:tcBorders>
-              <w:top w:val="single" w:sz="1" w:space="0" w:color="A0A0A0"/>
-              <w:left w:val="single" w:sz="1" w:space="0" w:color="A0A0A0"/>
-              <w:bottom w:val="single" w:sz="1" w:space="0" w:color="A0A0A0"/>
-              <w:right w:val="single" w:sz="1" w:space="0" w:color="A0A0A0"/>
-            </w:tcBorders>
-            <w:shd w:val="clear" w:color="auto" w:fill="FFFFFF"/>
-            <w:tcMar>
-              <w:top w:w="60" w:type="dxa"/>
-              <w:left w:w="100" w:type="dxa"/>
-              <w:bottom w:w="60" w:type="dxa"/>
-              <w:right w:w="100" w:type="dxa"/>
-            </w:tcMar>
-          </w:tcPr>
-          <w:p>
-            <w:pPr>
-              <w:rPr>
-                <w:rFonts w:eastAsia="Meiryo UI"/>
-              </w:rPr>
-            </w:pPr>
-          </w:p>
-          <w:p>
-            <w:pPr>
-              <w:rPr>
-                <w:rFonts w:eastAsia="Meiryo UI"/>
-              </w:rPr>
-            </w:pPr>
-          </w:p>
-        </w:tc>
-        <w:tc>
-          <w:tcPr>
-            <w:tcW w:w="1800" w:type="dxa"/>
-            <w:tcBorders>
-              <w:top w:val="single" w:sz="1" w:space="0" w:color="A0A0A0"/>
-              <w:left w:val="single" w:sz="1" w:space="0" w:color="A0A0A0"/>
-              <w:bottom w:val="single" w:sz="1" w:space="0" w:color="A0A0A0"/>
-              <w:right w:val="single" w:sz="1" w:space="0" w:color="A0A0A0"/>
-            </w:tcBorders>
-            <w:shd w:val="clear" w:color="auto" w:fill="FFFFFF"/>
-            <w:tcMar>
-              <w:top w:w="60" w:type="dxa"/>
-              <w:left w:w="100" w:type="dxa"/>
-              <w:bottom w:w="60" w:type="dxa"/>
-              <w:right w:w="100" w:type="dxa"/>
-            </w:tcMar>
-          </w:tcPr>
-          <w:p>
-            <w:pPr>
-              <w:rPr>
-                <w:rFonts w:eastAsia="Meiryo UI"/>
-              </w:rPr>
-            </w:pPr>
-          </w:p>
-          <w:p>
-            <w:pPr>
-              <w:rPr>
-                <w:rFonts w:eastAsia="Meiryo UI"/>
-              </w:rPr>
-            </w:pPr>
-          </w:p>
-        </w:tc>
-        <w:tc>
-          <w:tcPr>
-            <w:tcW w:w="1400" w:type="dxa"/>
-            <w:tcBorders>
-              <w:top w:val="single" w:sz="1" w:space="0" w:color="A0A0A0"/>
-              <w:left w:val="single" w:sz="1" w:space="0" w:color="A0A0A0"/>
-              <w:bottom w:val="single" w:sz="1" w:space="0" w:color="A0A0A0"/>
-              <w:right w:val="single" w:sz="1" w:space="0" w:color="A0A0A0"/>
-            </w:tcBorders>
-            <w:shd w:val="clear" w:color="auto" w:fill="FFFFFF"/>
-            <w:tcMar>
-              <w:top w:w="60" w:type="dxa"/>
-              <w:left w:w="100" w:type="dxa"/>
-              <w:bottom w:w="60" w:type="dxa"/>
-              <w:right w:w="100" w:type="dxa"/>
-            </w:tcMar>
-          </w:tcPr>
-          <w:p>
-            <w:pPr>
-              <w:rPr>
-                <w:rFonts w:eastAsia="Meiryo UI"/>
-              </w:rPr>
-            </w:pPr>
-          </w:p>
-          <w:p>
-            <w:pPr>
-              <w:rPr>
-                <w:rFonts w:eastAsia="Meiryo UI"/>
-              </w:rPr>
-            </w:pPr>
-          </w:p>
-        </w:tc>
-        <w:tc>
-          <w:tcPr>
-            <w:tcW w:w="3046" w:type="dxa"/>
+            <w:tcW w:w="2100" w:type="dxa"/>
+            <w:tcBorders>
+              <w:top w:val="single" w:sz="1" w:space="0" w:color="A0A0A0"/>
+              <w:left w:val="single" w:sz="1" w:space="0" w:color="A0A0A0"/>
+              <w:bottom w:val="single" w:sz="1" w:space="0" w:color="A0A0A0"/>
+              <w:right w:val="single" w:sz="1" w:space="0" w:color="A0A0A0"/>
+            </w:tcBorders>
+            <w:shd w:val="clear" w:color="auto" w:fill="FFFFFF"/>
+            <w:tcMar>
+              <w:top w:w="60" w:type="dxa"/>
+              <w:left w:w="100" w:type="dxa"/>
+              <w:bottom w:w="60" w:type="dxa"/>
+              <w:right w:w="100" w:type="dxa"/>
+            </w:tcMar>
+          </w:tcPr>
+          <w:p>
+            <w:pPr>
+              <w:rPr>
+                <w:rFonts w:eastAsia="Meiryo UI"/>
+              </w:rPr>
+            </w:pPr>
+          </w:p>
+          <w:p>
+            <w:pPr>
+              <w:rPr>
+                <w:rFonts w:eastAsia="Meiryo UI"/>
+              </w:rPr>
+            </w:pPr>
+          </w:p>
+        </w:tc>
+        <w:tc>
+          <w:tcPr>
+            <w:tcW w:w="1700" w:type="dxa"/>
+            <w:tcBorders>
+              <w:top w:val="single" w:sz="1" w:space="0" w:color="A0A0A0"/>
+              <w:left w:val="single" w:sz="1" w:space="0" w:color="A0A0A0"/>
+              <w:bottom w:val="single" w:sz="1" w:space="0" w:color="A0A0A0"/>
+              <w:right w:val="single" w:sz="1" w:space="0" w:color="A0A0A0"/>
+            </w:tcBorders>
+            <w:shd w:val="clear" w:color="auto" w:fill="FFFFFF"/>
+            <w:tcMar>
+              <w:top w:w="60" w:type="dxa"/>
+              <w:left w:w="100" w:type="dxa"/>
+              <w:bottom w:w="60" w:type="dxa"/>
+              <w:right w:w="100" w:type="dxa"/>
+            </w:tcMar>
+          </w:tcPr>
+          <w:p>
+            <w:pPr>
+              <w:rPr>
+                <w:rFonts w:eastAsia="Meiryo UI"/>
+              </w:rPr>
+            </w:pPr>
+          </w:p>
+          <w:p>
+            <w:pPr>
+              <w:rPr>
+                <w:rFonts w:eastAsia="Meiryo UI"/>
+              </w:rPr>
+            </w:pPr>
+          </w:p>
+        </w:tc>
+        <w:tc>
+          <w:tcPr>
+            <w:tcW w:w="2300" w:type="dxa"/>
+            <w:tcBorders>
+              <w:top w:val="single" w:sz="1" w:space="0" w:color="A0A0A0"/>
+              <w:left w:val="single" w:sz="1" w:space="0" w:color="A0A0A0"/>
+              <w:bottom w:val="single" w:sz="1" w:space="0" w:color="A0A0A0"/>
+              <w:right w:val="single" w:sz="1" w:space="0" w:color="A0A0A0"/>
+            </w:tcBorders>
+            <w:shd w:val="clear" w:color="auto" w:fill="FFFFFF"/>
+            <w:tcMar>
+              <w:top w:w="60" w:type="dxa"/>
+              <w:left w:w="100" w:type="dxa"/>
+              <w:bottom w:w="60" w:type="dxa"/>
+              <w:right w:w="100" w:type="dxa"/>
+            </w:tcMar>
+          </w:tcPr>
+          <w:p>
+            <w:pPr>
+              <w:rPr>
+                <w:rFonts w:eastAsia="Meiryo UI"/>
+              </w:rPr>
+            </w:pPr>
+          </w:p>
+          <w:p>
+            <w:pPr>
+              <w:rPr>
+                <w:rFonts w:eastAsia="Meiryo UI"/>
+              </w:rPr>
+            </w:pPr>
+          </w:p>
+        </w:tc>
+        <w:tc>
+          <w:tcPr>
+            <w:tcW w:w="2546" w:type="dxa"/>
             <w:tcBorders>
               <w:top w:val="single" w:sz="1" w:space="0" w:color="A0A0A0"/>
               <w:left w:val="single" w:sz="1" w:space="0" w:color="A0A0A0"/>
@@ -3361,103 +3337,103 @@
       <w:tr>
         <w:tc>
           <w:tcPr>
-            <w:tcW w:w="2400" w:type="dxa"/>
-            <w:tcBorders>
-              <w:top w:val="single" w:sz="1" w:space="0" w:color="A0A0A0"/>
-              <w:left w:val="single" w:sz="1" w:space="0" w:color="A0A0A0"/>
-              <w:bottom w:val="single" w:sz="1" w:space="0" w:color="A0A0A0"/>
-              <w:right w:val="single" w:sz="1" w:space="0" w:color="A0A0A0"/>
-            </w:tcBorders>
-            <w:shd w:val="clear" w:color="auto" w:fill="FFFFFF"/>
-            <w:tcMar>
-              <w:top w:w="60" w:type="dxa"/>
-              <w:left w:w="100" w:type="dxa"/>
-              <w:bottom w:w="60" w:type="dxa"/>
-              <w:right w:w="100" w:type="dxa"/>
-            </w:tcMar>
-          </w:tcPr>
-          <w:p>
-            <w:pPr>
-              <w:rPr>
-                <w:rFonts w:eastAsia="Meiryo UI"/>
-              </w:rPr>
-            </w:pPr>
-          </w:p>
-          <w:p>
-            <w:pPr>
-              <w:rPr>
-                <w:rFonts w:eastAsia="Meiryo UI"/>
-              </w:rPr>
-            </w:pPr>
-          </w:p>
-        </w:tc>
-        <w:tc>
-          <w:tcPr>
-            <w:tcW w:w="1800" w:type="dxa"/>
-            <w:tcBorders>
-              <w:top w:val="single" w:sz="1" w:space="0" w:color="A0A0A0"/>
-              <w:left w:val="single" w:sz="1" w:space="0" w:color="A0A0A0"/>
-              <w:bottom w:val="single" w:sz="1" w:space="0" w:color="A0A0A0"/>
-              <w:right w:val="single" w:sz="1" w:space="0" w:color="A0A0A0"/>
-            </w:tcBorders>
-            <w:shd w:val="clear" w:color="auto" w:fill="FFFFFF"/>
-            <w:tcMar>
-              <w:top w:w="60" w:type="dxa"/>
-              <w:left w:w="100" w:type="dxa"/>
-              <w:bottom w:w="60" w:type="dxa"/>
-              <w:right w:w="100" w:type="dxa"/>
-            </w:tcMar>
-          </w:tcPr>
-          <w:p>
-            <w:pPr>
-              <w:rPr>
-                <w:rFonts w:eastAsia="Meiryo UI"/>
-              </w:rPr>
-            </w:pPr>
-          </w:p>
-          <w:p>
-            <w:pPr>
-              <w:rPr>
-                <w:rFonts w:eastAsia="Meiryo UI"/>
-              </w:rPr>
-            </w:pPr>
-          </w:p>
-        </w:tc>
-        <w:tc>
-          <w:tcPr>
-            <w:tcW w:w="1400" w:type="dxa"/>
-            <w:tcBorders>
-              <w:top w:val="single" w:sz="1" w:space="0" w:color="A0A0A0"/>
-              <w:left w:val="single" w:sz="1" w:space="0" w:color="A0A0A0"/>
-              <w:bottom w:val="single" w:sz="1" w:space="0" w:color="A0A0A0"/>
-              <w:right w:val="single" w:sz="1" w:space="0" w:color="A0A0A0"/>
-            </w:tcBorders>
-            <w:shd w:val="clear" w:color="auto" w:fill="FFFFFF"/>
-            <w:tcMar>
-              <w:top w:w="60" w:type="dxa"/>
-              <w:left w:w="100" w:type="dxa"/>
-              <w:bottom w:w="60" w:type="dxa"/>
-              <w:right w:w="100" w:type="dxa"/>
-            </w:tcMar>
-          </w:tcPr>
-          <w:p>
-            <w:pPr>
-              <w:rPr>
-                <w:rFonts w:eastAsia="Meiryo UI"/>
-              </w:rPr>
-            </w:pPr>
-          </w:p>
-          <w:p>
-            <w:pPr>
-              <w:rPr>
-                <w:rFonts w:eastAsia="Meiryo UI"/>
-              </w:rPr>
-            </w:pPr>
-          </w:p>
-        </w:tc>
-        <w:tc>
-          <w:tcPr>
-            <w:tcW w:w="3046" w:type="dxa"/>
+            <w:tcW w:w="2100" w:type="dxa"/>
+            <w:tcBorders>
+              <w:top w:val="single" w:sz="1" w:space="0" w:color="A0A0A0"/>
+              <w:left w:val="single" w:sz="1" w:space="0" w:color="A0A0A0"/>
+              <w:bottom w:val="single" w:sz="1" w:space="0" w:color="A0A0A0"/>
+              <w:right w:val="single" w:sz="1" w:space="0" w:color="A0A0A0"/>
+            </w:tcBorders>
+            <w:shd w:val="clear" w:color="auto" w:fill="FFFFFF"/>
+            <w:tcMar>
+              <w:top w:w="60" w:type="dxa"/>
+              <w:left w:w="100" w:type="dxa"/>
+              <w:bottom w:w="60" w:type="dxa"/>
+              <w:right w:w="100" w:type="dxa"/>
+            </w:tcMar>
+          </w:tcPr>
+          <w:p>
+            <w:pPr>
+              <w:rPr>
+                <w:rFonts w:eastAsia="Meiryo UI"/>
+              </w:rPr>
+            </w:pPr>
+          </w:p>
+          <w:p>
+            <w:pPr>
+              <w:rPr>
+                <w:rFonts w:eastAsia="Meiryo UI"/>
+              </w:rPr>
+            </w:pPr>
+          </w:p>
+        </w:tc>
+        <w:tc>
+          <w:tcPr>
+            <w:tcW w:w="1700" w:type="dxa"/>
+            <w:tcBorders>
+              <w:top w:val="single" w:sz="1" w:space="0" w:color="A0A0A0"/>
+              <w:left w:val="single" w:sz="1" w:space="0" w:color="A0A0A0"/>
+              <w:bottom w:val="single" w:sz="1" w:space="0" w:color="A0A0A0"/>
+              <w:right w:val="single" w:sz="1" w:space="0" w:color="A0A0A0"/>
+            </w:tcBorders>
+            <w:shd w:val="clear" w:color="auto" w:fill="FFFFFF"/>
+            <w:tcMar>
+              <w:top w:w="60" w:type="dxa"/>
+              <w:left w:w="100" w:type="dxa"/>
+              <w:bottom w:w="60" w:type="dxa"/>
+              <w:right w:w="100" w:type="dxa"/>
+            </w:tcMar>
+          </w:tcPr>
+          <w:p>
+            <w:pPr>
+              <w:rPr>
+                <w:rFonts w:eastAsia="Meiryo UI"/>
+              </w:rPr>
+            </w:pPr>
+          </w:p>
+          <w:p>
+            <w:pPr>
+              <w:rPr>
+                <w:rFonts w:eastAsia="Meiryo UI"/>
+              </w:rPr>
+            </w:pPr>
+          </w:p>
+        </w:tc>
+        <w:tc>
+          <w:tcPr>
+            <w:tcW w:w="2300" w:type="dxa"/>
+            <w:tcBorders>
+              <w:top w:val="single" w:sz="1" w:space="0" w:color="A0A0A0"/>
+              <w:left w:val="single" w:sz="1" w:space="0" w:color="A0A0A0"/>
+              <w:bottom w:val="single" w:sz="1" w:space="0" w:color="A0A0A0"/>
+              <w:right w:val="single" w:sz="1" w:space="0" w:color="A0A0A0"/>
+            </w:tcBorders>
+            <w:shd w:val="clear" w:color="auto" w:fill="FFFFFF"/>
+            <w:tcMar>
+              <w:top w:w="60" w:type="dxa"/>
+              <w:left w:w="100" w:type="dxa"/>
+              <w:bottom w:w="60" w:type="dxa"/>
+              <w:right w:w="100" w:type="dxa"/>
+            </w:tcMar>
+          </w:tcPr>
+          <w:p>
+            <w:pPr>
+              <w:rPr>
+                <w:rFonts w:eastAsia="Meiryo UI"/>
+              </w:rPr>
+            </w:pPr>
+          </w:p>
+          <w:p>
+            <w:pPr>
+              <w:rPr>
+                <w:rFonts w:eastAsia="Meiryo UI"/>
+              </w:rPr>
+            </w:pPr>
+          </w:p>
+        </w:tc>
+        <w:tc>
+          <w:tcPr>
+            <w:tcW w:w="2546" w:type="dxa"/>
             <w:tcBorders>
               <w:top w:val="single" w:sz="1" w:space="0" w:color="A0A0A0"/>
               <w:left w:val="single" w:sz="1" w:space="0" w:color="A0A0A0"/>
@@ -5274,7 +5250,7 @@
           <w:sz w:val="18"/>
           <w:szCs w:val="18"/>
         </w:rPr>
-        <w:t>各自が持ち寄った案を共有し、型の異なる2案を残して比べて決めます。1つを選ばず、複数の案を組み合わせてもかまいません。型（チャットボット／AIエージェント／AIワークフロー）は、ここで決めます。</w:t>
+        <w:t>各自が持ち寄った案を共有し、グループで作るAIツールを決めます。1つを選ばず、複数の案を組み合わせてもかまいません。作るAIツールの種類（チャットボット／AIエージェント／AIワークフロー）も、ここで決めます。</w:t>
       </w:r>
     </w:p>
     <w:tbl>
@@ -5295,10 +5271,10 @@
         <w:tblLook w:val="0000" w:firstRow="0" w:lastRow="0" w:firstColumn="0" w:lastColumn="0" w:noHBand="0" w:noVBand="0"/>
       </w:tblPr>
       <w:tblGrid>
-        <w:gridCol w:w="2505"/>
-        <w:gridCol w:w="1879"/>
-        <w:gridCol w:w="1462"/>
-        <w:gridCol w:w="3180"/>
+        <w:gridCol w:w="2100"/>
+        <w:gridCol w:w="1700"/>
+        <w:gridCol w:w="2300"/>
+        <w:gridCol w:w="2546"/>
       </w:tblGrid>
       <w:tr>
         <w:trPr>
@@ -5306,7 +5282,7 @@
         </w:trPr>
         <w:tc>
           <w:tcPr>
-            <w:tcW w:w="2400" w:type="dxa"/>
+            <w:tcW w:w="2100" w:type="dxa"/>
             <w:tcBorders>
               <w:top w:val="single" w:sz="1" w:space="0" w:color="A0A0A0"/>
               <w:left w:val="single" w:sz="1" w:space="0" w:color="A0A0A0"/>
@@ -5342,7 +5318,7 @@
         </w:tc>
         <w:tc>
           <w:tcPr>
-            <w:tcW w:w="1800" w:type="dxa"/>
+            <w:tcW w:w="1700" w:type="dxa"/>
             <w:tcBorders>
               <w:top w:val="single" w:sz="1" w:space="0" w:color="A0A0A0"/>
               <w:left w:val="single" w:sz="1" w:space="0" w:color="A0A0A0"/>
@@ -5378,7 +5354,7 @@
         </w:tc>
         <w:tc>
           <w:tcPr>
-            <w:tcW w:w="1400" w:type="dxa"/>
+            <w:tcW w:w="2300" w:type="dxa"/>
             <w:tcBorders>
               <w:top w:val="single" w:sz="1" w:space="0" w:color="A0A0A0"/>
               <w:left w:val="single" w:sz="1" w:space="0" w:color="A0A0A0"/>
@@ -5408,13 +5384,13 @@
                 <w:sz w:val="19"/>
                 <w:szCs w:val="19"/>
               </w:rPr>
-              <w:t>使う型</w:t>
-            </w:r>
-          </w:p>
-        </w:tc>
-        <w:tc>
-          <w:tcPr>
-            <w:tcW w:w="3046" w:type="dxa"/>
+              <w:t>作るAIツールの種類</w:t>
+            </w:r>
+          </w:p>
+        </w:tc>
+        <w:tc>
+          <w:tcPr>
+            <w:tcW w:w="2546" w:type="dxa"/>
             <w:tcBorders>
               <w:top w:val="single" w:sz="1" w:space="0" w:color="A0A0A0"/>
               <w:left w:val="single" w:sz="1" w:space="0" w:color="A0A0A0"/>
@@ -5452,7 +5428,7 @@
       <w:tr>
         <w:tc>
           <w:tcPr>
-            <w:tcW w:w="2400" w:type="dxa"/>
+            <w:tcW w:w="2100" w:type="dxa"/>
             <w:tcBorders>
               <w:top w:val="single" w:sz="1" w:space="0" w:color="A0A0A0"/>
               <w:left w:val="single" w:sz="1" w:space="0" w:color="A0A0A0"/>
@@ -5493,7 +5469,7 @@
         </w:tc>
         <w:tc>
           <w:tcPr>
-            <w:tcW w:w="1800" w:type="dxa"/>
+            <w:tcW w:w="1700" w:type="dxa"/>
             <w:tcBorders>
               <w:top w:val="single" w:sz="1" w:space="0" w:color="A0A0A0"/>
               <w:left w:val="single" w:sz="1" w:space="0" w:color="A0A0A0"/>
@@ -5527,7 +5503,7 @@
         </w:tc>
         <w:tc>
           <w:tcPr>
-            <w:tcW w:w="1400" w:type="dxa"/>
+            <w:tcW w:w="2300" w:type="dxa"/>
             <w:tcBorders>
               <w:top w:val="single" w:sz="1" w:space="0" w:color="A0A0A0"/>
               <w:left w:val="single" w:sz="1" w:space="0" w:color="A0A0A0"/>
@@ -5561,7 +5537,7 @@
         </w:tc>
         <w:tc>
           <w:tcPr>
-            <w:tcW w:w="3046" w:type="dxa"/>
+            <w:tcW w:w="2546" w:type="dxa"/>
             <w:tcBorders>
               <w:top w:val="single" w:sz="1" w:space="0" w:color="A0A0A0"/>
               <w:left w:val="single" w:sz="1" w:space="0" w:color="A0A0A0"/>
@@ -5604,103 +5580,103 @@
       <w:tr>
         <w:tc>
           <w:tcPr>
-            <w:tcW w:w="2400" w:type="dxa"/>
-            <w:tcBorders>
-              <w:top w:val="single" w:sz="1" w:space="0" w:color="A0A0A0"/>
-              <w:left w:val="single" w:sz="1" w:space="0" w:color="A0A0A0"/>
-              <w:bottom w:val="single" w:sz="1" w:space="0" w:color="A0A0A0"/>
-              <w:right w:val="single" w:sz="1" w:space="0" w:color="A0A0A0"/>
-            </w:tcBorders>
-            <w:shd w:val="clear" w:color="auto" w:fill="FFFFFF"/>
-            <w:tcMar>
-              <w:top w:w="60" w:type="dxa"/>
-              <w:left w:w="100" w:type="dxa"/>
-              <w:bottom w:w="60" w:type="dxa"/>
-              <w:right w:w="100" w:type="dxa"/>
-            </w:tcMar>
-          </w:tcPr>
-          <w:p>
-            <w:pPr>
-              <w:rPr>
-                <w:rFonts w:eastAsia="Meiryo UI"/>
-              </w:rPr>
-            </w:pPr>
-          </w:p>
-          <w:p>
-            <w:pPr>
-              <w:rPr>
-                <w:rFonts w:eastAsia="Meiryo UI"/>
-              </w:rPr>
-            </w:pPr>
-          </w:p>
-        </w:tc>
-        <w:tc>
-          <w:tcPr>
-            <w:tcW w:w="1800" w:type="dxa"/>
-            <w:tcBorders>
-              <w:top w:val="single" w:sz="1" w:space="0" w:color="A0A0A0"/>
-              <w:left w:val="single" w:sz="1" w:space="0" w:color="A0A0A0"/>
-              <w:bottom w:val="single" w:sz="1" w:space="0" w:color="A0A0A0"/>
-              <w:right w:val="single" w:sz="1" w:space="0" w:color="A0A0A0"/>
-            </w:tcBorders>
-            <w:shd w:val="clear" w:color="auto" w:fill="FFFFFF"/>
-            <w:tcMar>
-              <w:top w:w="60" w:type="dxa"/>
-              <w:left w:w="100" w:type="dxa"/>
-              <w:bottom w:w="60" w:type="dxa"/>
-              <w:right w:w="100" w:type="dxa"/>
-            </w:tcMar>
-          </w:tcPr>
-          <w:p>
-            <w:pPr>
-              <w:rPr>
-                <w:rFonts w:eastAsia="Meiryo UI"/>
-              </w:rPr>
-            </w:pPr>
-          </w:p>
-          <w:p>
-            <w:pPr>
-              <w:rPr>
-                <w:rFonts w:eastAsia="Meiryo UI"/>
-              </w:rPr>
-            </w:pPr>
-          </w:p>
-        </w:tc>
-        <w:tc>
-          <w:tcPr>
-            <w:tcW w:w="1400" w:type="dxa"/>
-            <w:tcBorders>
-              <w:top w:val="single" w:sz="1" w:space="0" w:color="A0A0A0"/>
-              <w:left w:val="single" w:sz="1" w:space="0" w:color="A0A0A0"/>
-              <w:bottom w:val="single" w:sz="1" w:space="0" w:color="A0A0A0"/>
-              <w:right w:val="single" w:sz="1" w:space="0" w:color="A0A0A0"/>
-            </w:tcBorders>
-            <w:shd w:val="clear" w:color="auto" w:fill="FFFFFF"/>
-            <w:tcMar>
-              <w:top w:w="60" w:type="dxa"/>
-              <w:left w:w="100" w:type="dxa"/>
-              <w:bottom w:w="60" w:type="dxa"/>
-              <w:right w:w="100" w:type="dxa"/>
-            </w:tcMar>
-          </w:tcPr>
-          <w:p>
-            <w:pPr>
-              <w:rPr>
-                <w:rFonts w:eastAsia="Meiryo UI"/>
-              </w:rPr>
-            </w:pPr>
-          </w:p>
-          <w:p>
-            <w:pPr>
-              <w:rPr>
-                <w:rFonts w:eastAsia="Meiryo UI"/>
-              </w:rPr>
-            </w:pPr>
-          </w:p>
-        </w:tc>
-        <w:tc>
-          <w:tcPr>
-            <w:tcW w:w="3046" w:type="dxa"/>
+            <w:tcW w:w="2100" w:type="dxa"/>
+            <w:tcBorders>
+              <w:top w:val="single" w:sz="1" w:space="0" w:color="A0A0A0"/>
+              <w:left w:val="single" w:sz="1" w:space="0" w:color="A0A0A0"/>
+              <w:bottom w:val="single" w:sz="1" w:space="0" w:color="A0A0A0"/>
+              <w:right w:val="single" w:sz="1" w:space="0" w:color="A0A0A0"/>
+            </w:tcBorders>
+            <w:shd w:val="clear" w:color="auto" w:fill="FFFFFF"/>
+            <w:tcMar>
+              <w:top w:w="60" w:type="dxa"/>
+              <w:left w:w="100" w:type="dxa"/>
+              <w:bottom w:w="60" w:type="dxa"/>
+              <w:right w:w="100" w:type="dxa"/>
+            </w:tcMar>
+          </w:tcPr>
+          <w:p>
+            <w:pPr>
+              <w:rPr>
+                <w:rFonts w:eastAsia="Meiryo UI"/>
+              </w:rPr>
+            </w:pPr>
+          </w:p>
+          <w:p>
+            <w:pPr>
+              <w:rPr>
+                <w:rFonts w:eastAsia="Meiryo UI"/>
+              </w:rPr>
+            </w:pPr>
+          </w:p>
+        </w:tc>
+        <w:tc>
+          <w:tcPr>
+            <w:tcW w:w="1700" w:type="dxa"/>
+            <w:tcBorders>
+              <w:top w:val="single" w:sz="1" w:space="0" w:color="A0A0A0"/>
+              <w:left w:val="single" w:sz="1" w:space="0" w:color="A0A0A0"/>
+              <w:bottom w:val="single" w:sz="1" w:space="0" w:color="A0A0A0"/>
+              <w:right w:val="single" w:sz="1" w:space="0" w:color="A0A0A0"/>
+            </w:tcBorders>
+            <w:shd w:val="clear" w:color="auto" w:fill="FFFFFF"/>
+            <w:tcMar>
+              <w:top w:w="60" w:type="dxa"/>
+              <w:left w:w="100" w:type="dxa"/>
+              <w:bottom w:w="60" w:type="dxa"/>
+              <w:right w:w="100" w:type="dxa"/>
+            </w:tcMar>
+          </w:tcPr>
+          <w:p>
+            <w:pPr>
+              <w:rPr>
+                <w:rFonts w:eastAsia="Meiryo UI"/>
+              </w:rPr>
+            </w:pPr>
+          </w:p>
+          <w:p>
+            <w:pPr>
+              <w:rPr>
+                <w:rFonts w:eastAsia="Meiryo UI"/>
+              </w:rPr>
+            </w:pPr>
+          </w:p>
+        </w:tc>
+        <w:tc>
+          <w:tcPr>
+            <w:tcW w:w="2300" w:type="dxa"/>
+            <w:tcBorders>
+              <w:top w:val="single" w:sz="1" w:space="0" w:color="A0A0A0"/>
+              <w:left w:val="single" w:sz="1" w:space="0" w:color="A0A0A0"/>
+              <w:bottom w:val="single" w:sz="1" w:space="0" w:color="A0A0A0"/>
+              <w:right w:val="single" w:sz="1" w:space="0" w:color="A0A0A0"/>
+            </w:tcBorders>
+            <w:shd w:val="clear" w:color="auto" w:fill="FFFFFF"/>
+            <w:tcMar>
+              <w:top w:w="60" w:type="dxa"/>
+              <w:left w:w="100" w:type="dxa"/>
+              <w:bottom w:w="60" w:type="dxa"/>
+              <w:right w:w="100" w:type="dxa"/>
+            </w:tcMar>
+          </w:tcPr>
+          <w:p>
+            <w:pPr>
+              <w:rPr>
+                <w:rFonts w:eastAsia="Meiryo UI"/>
+              </w:rPr>
+            </w:pPr>
+          </w:p>
+          <w:p>
+            <w:pPr>
+              <w:rPr>
+                <w:rFonts w:eastAsia="Meiryo UI"/>
+              </w:rPr>
+            </w:pPr>
+          </w:p>
+        </w:tc>
+        <w:tc>
+          <w:tcPr>
+            <w:tcW w:w="2546" w:type="dxa"/>
             <w:tcBorders>
               <w:top w:val="single" w:sz="1" w:space="0" w:color="A0A0A0"/>
               <w:left w:val="single" w:sz="1" w:space="0" w:color="A0A0A0"/>
@@ -5734,103 +5710,103 @@
       <w:tr>
         <w:tc>
           <w:tcPr>
-            <w:tcW w:w="2400" w:type="dxa"/>
-            <w:tcBorders>
-              <w:top w:val="single" w:sz="1" w:space="0" w:color="A0A0A0"/>
-              <w:left w:val="single" w:sz="1" w:space="0" w:color="A0A0A0"/>
-              <w:bottom w:val="single" w:sz="1" w:space="0" w:color="A0A0A0"/>
-              <w:right w:val="single" w:sz="1" w:space="0" w:color="A0A0A0"/>
-            </w:tcBorders>
-            <w:shd w:val="clear" w:color="auto" w:fill="FFFFFF"/>
-            <w:tcMar>
-              <w:top w:w="60" w:type="dxa"/>
-              <w:left w:w="100" w:type="dxa"/>
-              <w:bottom w:w="60" w:type="dxa"/>
-              <w:right w:w="100" w:type="dxa"/>
-            </w:tcMar>
-          </w:tcPr>
-          <w:p>
-            <w:pPr>
-              <w:rPr>
-                <w:rFonts w:eastAsia="Meiryo UI"/>
-              </w:rPr>
-            </w:pPr>
-          </w:p>
-          <w:p>
-            <w:pPr>
-              <w:rPr>
-                <w:rFonts w:eastAsia="Meiryo UI"/>
-              </w:rPr>
-            </w:pPr>
-          </w:p>
-        </w:tc>
-        <w:tc>
-          <w:tcPr>
-            <w:tcW w:w="1800" w:type="dxa"/>
-            <w:tcBorders>
-              <w:top w:val="single" w:sz="1" w:space="0" w:color="A0A0A0"/>
-              <w:left w:val="single" w:sz="1" w:space="0" w:color="A0A0A0"/>
-              <w:bottom w:val="single" w:sz="1" w:space="0" w:color="A0A0A0"/>
-              <w:right w:val="single" w:sz="1" w:space="0" w:color="A0A0A0"/>
-            </w:tcBorders>
-            <w:shd w:val="clear" w:color="auto" w:fill="FFFFFF"/>
-            <w:tcMar>
-              <w:top w:w="60" w:type="dxa"/>
-              <w:left w:w="100" w:type="dxa"/>
-              <w:bottom w:w="60" w:type="dxa"/>
-              <w:right w:w="100" w:type="dxa"/>
-            </w:tcMar>
-          </w:tcPr>
-          <w:p>
-            <w:pPr>
-              <w:rPr>
-                <w:rFonts w:eastAsia="Meiryo UI"/>
-              </w:rPr>
-            </w:pPr>
-          </w:p>
-          <w:p>
-            <w:pPr>
-              <w:rPr>
-                <w:rFonts w:eastAsia="Meiryo UI"/>
-              </w:rPr>
-            </w:pPr>
-          </w:p>
-        </w:tc>
-        <w:tc>
-          <w:tcPr>
-            <w:tcW w:w="1400" w:type="dxa"/>
-            <w:tcBorders>
-              <w:top w:val="single" w:sz="1" w:space="0" w:color="A0A0A0"/>
-              <w:left w:val="single" w:sz="1" w:space="0" w:color="A0A0A0"/>
-              <w:bottom w:val="single" w:sz="1" w:space="0" w:color="A0A0A0"/>
-              <w:right w:val="single" w:sz="1" w:space="0" w:color="A0A0A0"/>
-            </w:tcBorders>
-            <w:shd w:val="clear" w:color="auto" w:fill="FFFFFF"/>
-            <w:tcMar>
-              <w:top w:w="60" w:type="dxa"/>
-              <w:left w:w="100" w:type="dxa"/>
-              <w:bottom w:w="60" w:type="dxa"/>
-              <w:right w:w="100" w:type="dxa"/>
-            </w:tcMar>
-          </w:tcPr>
-          <w:p>
-            <w:pPr>
-              <w:rPr>
-                <w:rFonts w:eastAsia="Meiryo UI"/>
-              </w:rPr>
-            </w:pPr>
-          </w:p>
-          <w:p>
-            <w:pPr>
-              <w:rPr>
-                <w:rFonts w:eastAsia="Meiryo UI"/>
-              </w:rPr>
-            </w:pPr>
-          </w:p>
-        </w:tc>
-        <w:tc>
-          <w:tcPr>
-            <w:tcW w:w="3046" w:type="dxa"/>
+            <w:tcW w:w="2100" w:type="dxa"/>
+            <w:tcBorders>
+              <w:top w:val="single" w:sz="1" w:space="0" w:color="A0A0A0"/>
+              <w:left w:val="single" w:sz="1" w:space="0" w:color="A0A0A0"/>
+              <w:bottom w:val="single" w:sz="1" w:space="0" w:color="A0A0A0"/>
+              <w:right w:val="single" w:sz="1" w:space="0" w:color="A0A0A0"/>
+            </w:tcBorders>
+            <w:shd w:val="clear" w:color="auto" w:fill="FFFFFF"/>
+            <w:tcMar>
+              <w:top w:w="60" w:type="dxa"/>
+              <w:left w:w="100" w:type="dxa"/>
+              <w:bottom w:w="60" w:type="dxa"/>
+              <w:right w:w="100" w:type="dxa"/>
+            </w:tcMar>
+          </w:tcPr>
+          <w:p>
+            <w:pPr>
+              <w:rPr>
+                <w:rFonts w:eastAsia="Meiryo UI"/>
+              </w:rPr>
+            </w:pPr>
+          </w:p>
+          <w:p>
+            <w:pPr>
+              <w:rPr>
+                <w:rFonts w:eastAsia="Meiryo UI"/>
+              </w:rPr>
+            </w:pPr>
+          </w:p>
+        </w:tc>
+        <w:tc>
+          <w:tcPr>
+            <w:tcW w:w="1700" w:type="dxa"/>
+            <w:tcBorders>
+              <w:top w:val="single" w:sz="1" w:space="0" w:color="A0A0A0"/>
+              <w:left w:val="single" w:sz="1" w:space="0" w:color="A0A0A0"/>
+              <w:bottom w:val="single" w:sz="1" w:space="0" w:color="A0A0A0"/>
+              <w:right w:val="single" w:sz="1" w:space="0" w:color="A0A0A0"/>
+            </w:tcBorders>
+            <w:shd w:val="clear" w:color="auto" w:fill="FFFFFF"/>
+            <w:tcMar>
+              <w:top w:w="60" w:type="dxa"/>
+              <w:left w:w="100" w:type="dxa"/>
+              <w:bottom w:w="60" w:type="dxa"/>
+              <w:right w:w="100" w:type="dxa"/>
+            </w:tcMar>
+          </w:tcPr>
+          <w:p>
+            <w:pPr>
+              <w:rPr>
+                <w:rFonts w:eastAsia="Meiryo UI"/>
+              </w:rPr>
+            </w:pPr>
+          </w:p>
+          <w:p>
+            <w:pPr>
+              <w:rPr>
+                <w:rFonts w:eastAsia="Meiryo UI"/>
+              </w:rPr>
+            </w:pPr>
+          </w:p>
+        </w:tc>
+        <w:tc>
+          <w:tcPr>
+            <w:tcW w:w="2300" w:type="dxa"/>
+            <w:tcBorders>
+              <w:top w:val="single" w:sz="1" w:space="0" w:color="A0A0A0"/>
+              <w:left w:val="single" w:sz="1" w:space="0" w:color="A0A0A0"/>
+              <w:bottom w:val="single" w:sz="1" w:space="0" w:color="A0A0A0"/>
+              <w:right w:val="single" w:sz="1" w:space="0" w:color="A0A0A0"/>
+            </w:tcBorders>
+            <w:shd w:val="clear" w:color="auto" w:fill="FFFFFF"/>
+            <w:tcMar>
+              <w:top w:w="60" w:type="dxa"/>
+              <w:left w:w="100" w:type="dxa"/>
+              <w:bottom w:w="60" w:type="dxa"/>
+              <w:right w:w="100" w:type="dxa"/>
+            </w:tcMar>
+          </w:tcPr>
+          <w:p>
+            <w:pPr>
+              <w:rPr>
+                <w:rFonts w:eastAsia="Meiryo UI"/>
+              </w:rPr>
+            </w:pPr>
+          </w:p>
+          <w:p>
+            <w:pPr>
+              <w:rPr>
+                <w:rFonts w:eastAsia="Meiryo UI"/>
+              </w:rPr>
+            </w:pPr>
+          </w:p>
+        </w:tc>
+        <w:tc>
+          <w:tcPr>
+            <w:tcW w:w="2546" w:type="dxa"/>
             <w:tcBorders>
               <w:top w:val="single" w:sz="1" w:space="0" w:color="A0A0A0"/>
               <w:left w:val="single" w:sz="1" w:space="0" w:color="A0A0A0"/>

</xml_diff>